<commit_message>
Publish revision 18: abstract within cap, refreshed Word and PDF
</commit_message>
<xml_diff>
--- a/HIT_Artificial_Intelligence_(Applications)_Alexander_Apartsin.docx
+++ b/HIT_Artificial_Intelligence_(Applications)_Alexander_Apartsin.docx
@@ -920,7 +920,49 @@
                     <w:rFonts w:asciiTheme="majorBidi" w:eastAsia="Times New Roman" w:hAnsiTheme="majorBidi" w:cstheme="majorBidi"/>
                     <w:rtl/>
                   </w:rPr>
-                  <w:t>מערכות רשומה רפואית אלקטרונית (EHR) מתעדות רשומות ועובדות קליניות מובנות, אך שכבה תפעולית חשובה נותרת לעיתים קרובות בטקסט החופשי בלבד: הכוונה הקלינית, כלומר, מה אמור להתבצע בהמשך עבור המטופל. הנחיות כגון "לחזור על בדיקת MRI בעוד שבועיים אם התסמינים נמשכים" עלולות לפיכך שלא להיקלט במערכות המשמשות לזימון תורים, מעקב ובקרה.</w:t>
+                  <w:t xml:space="preserve">מערכות רשומה רפואית אלקטרונית (EHR) מתעדות רשומות ועובדות קליניות מובנות, אך שכבה תפעולית חשובה נותרת לעיתים קרובות בטקסט החופשי בלבד: הכוונה </w:t>
+                </w:r>
+                <w:r>
+                  <w:rPr>
+                    <w:rFonts w:asciiTheme="majorBidi" w:eastAsia="Times New Roman" w:hAnsiTheme="majorBidi" w:cstheme="majorBidi" w:hint="cs"/>
+                    <w:rtl/>
+                  </w:rPr>
+                  <w:t xml:space="preserve">והמלצות </w:t>
+                </w:r>
+                <w:r>
+                  <w:rPr>
+                    <w:rFonts w:asciiTheme="majorBidi" w:eastAsia="Times New Roman" w:hAnsiTheme="majorBidi" w:cstheme="majorBidi"/>
+                    <w:rtl/>
+                  </w:rPr>
+                  <w:t>הקליני</w:t>
+                </w:r>
+                <w:r>
+                  <w:rPr>
+                    <w:rFonts w:asciiTheme="majorBidi" w:eastAsia="Times New Roman" w:hAnsiTheme="majorBidi" w:cstheme="majorBidi" w:hint="cs"/>
+                    <w:rtl/>
+                  </w:rPr>
+                  <w:t>ו</w:t>
+                </w:r>
+                <w:r>
+                  <w:rPr>
+                    <w:rFonts w:asciiTheme="majorBidi" w:eastAsia="Times New Roman" w:hAnsiTheme="majorBidi" w:cstheme="majorBidi"/>
+                    <w:rtl/>
+                  </w:rPr>
+                  <w:t>ת, כלומר, מה אמור להתבצע בהמשך עבור המטופל</w:t>
+                </w:r>
+                <w:r>
+                  <w:rPr>
+                    <w:rFonts w:asciiTheme="majorBidi" w:eastAsia="Times New Roman" w:hAnsiTheme="majorBidi" w:cstheme="majorBidi" w:hint="cs"/>
+                    <w:rtl/>
+                  </w:rPr>
+                  <w:t xml:space="preserve"> ועל ידו</w:t>
+                </w:r>
+                <w:r>
+                  <w:rPr>
+                    <w:rFonts w:asciiTheme="majorBidi" w:eastAsia="Times New Roman" w:hAnsiTheme="majorBidi" w:cstheme="majorBidi"/>
+                    <w:rtl/>
+                  </w:rPr>
+                  <w:t>. הנחיות כגון "לחזור על בדיקת MRI בעוד שבועיים אם התסמינים נמשכים" עלולות לפיכך שלא להיקלט במערכות המשמשות לזימון תורים, מעקב ובקרה.</w:t>
                 </w:r>
               </w:p>
               <w:p>
@@ -938,55 +980,7 @@
                     <w:rFonts w:asciiTheme="majorBidi" w:eastAsia="Times New Roman" w:hAnsiTheme="majorBidi" w:cstheme="majorBidi"/>
                     <w:rtl/>
                   </w:rPr>
-                  <w:t>CareLoop ממירה הנחיות כאלה לפעולות מובנות, מקושרות למקור וניתנות לבקרה. החידוש המרכזי הוא בגישת ניהול כוונה קלינית (</w:t>
-                </w:r>
-                <w:proofErr w:type="spellStart"/>
-                <w:r>
-                  <w:rPr>
-                    <w:rFonts w:asciiTheme="majorBidi" w:eastAsia="Times New Roman" w:hAnsiTheme="majorBidi" w:cstheme="majorBidi"/>
-                    <w:rtl/>
-                  </w:rPr>
-                  <w:t>Clinical</w:t>
-                </w:r>
-                <w:proofErr w:type="spellEnd"/>
-                <w:r>
-                  <w:rPr>
-                    <w:rFonts w:asciiTheme="majorBidi" w:eastAsia="Times New Roman" w:hAnsiTheme="majorBidi" w:cstheme="majorBidi"/>
-                    <w:rtl/>
-                  </w:rPr>
-                  <w:t xml:space="preserve"> </w:t>
-                </w:r>
-                <w:proofErr w:type="spellStart"/>
-                <w:r>
-                  <w:rPr>
-                    <w:rFonts w:asciiTheme="majorBidi" w:eastAsia="Times New Roman" w:hAnsiTheme="majorBidi" w:cstheme="majorBidi"/>
-                    <w:rtl/>
-                  </w:rPr>
-                  <w:t>Intent</w:t>
-                </w:r>
-                <w:proofErr w:type="spellEnd"/>
-                <w:r>
-                  <w:rPr>
-                    <w:rFonts w:asciiTheme="majorBidi" w:eastAsia="Times New Roman" w:hAnsiTheme="majorBidi" w:cstheme="majorBidi"/>
-                    <w:rtl/>
-                  </w:rPr>
-                  <w:t xml:space="preserve"> </w:t>
-                </w:r>
-                <w:proofErr w:type="spellStart"/>
-                <w:r>
-                  <w:rPr>
-                    <w:rFonts w:asciiTheme="majorBidi" w:eastAsia="Times New Roman" w:hAnsiTheme="majorBidi" w:cstheme="majorBidi"/>
-                    <w:rtl/>
-                  </w:rPr>
-                  <w:t>Management</w:t>
-                </w:r>
-                <w:proofErr w:type="spellEnd"/>
-                <w:r>
-                  <w:rPr>
-                    <w:rFonts w:asciiTheme="majorBidi" w:eastAsia="Times New Roman" w:hAnsiTheme="majorBidi" w:cstheme="majorBidi"/>
-                    <w:rtl/>
-                  </w:rPr>
-                  <w:t xml:space="preserve">, CIM): שכבת תשתית גנרית בין הטקסט הקליני ההטרוגני לבין תהליכי העבודה הפועלים על </w:t>
+                  <w:t xml:space="preserve">CareLoop ממירה הנחיות כאלה לפעולות מובנות, מקושרות למקור וניתנות לבקרה. החידוש המרכזי הוא בגישת ניהול כוונה קלינית (Clinical Intent Management, CIM): שכבת תשתית גנרית בין הטקסט הקליני ההטרוגני לבין תהליכי העבודה הפועלים על </w:t>
                 </w:r>
                 <w:r>
                   <w:rPr>
@@ -1014,7 +1008,7 @@
                     <w:rFonts w:asciiTheme="majorBidi" w:eastAsia="Times New Roman" w:hAnsiTheme="majorBidi" w:cs="Times New Roman"/>
                     <w:rtl/>
                   </w:rPr>
-                  <w:t xml:space="preserve"> הקלינית באה לידי ביטוי בהפניות, בהוראות, בתוכניות מותנות ובהנחיות מעקב; ה-</w:t>
+                  <w:t xml:space="preserve"> קלינית באה לידי ביטוי בהפניות, בהוראות, בתוכניות מותנות ובהנחיות מעקב; ה-</w:t>
                 </w:r>
                 <w:r>
                   <w:rPr>
@@ -1051,39 +1045,7 @@
                     <w:rFonts w:asciiTheme="majorBidi" w:eastAsia="Times New Roman" w:hAnsiTheme="majorBidi" w:cstheme="majorBidi"/>
                     <w:rtl/>
                   </w:rPr>
-                  <w:t>אי-הוודאות המרכזית שנותרה היא האם השיטה עוברת באופן אמין ממאגר מבוקר לטקסט קליני אמיתי והטרוגני ויכולה להשתלב בתהליך עבודה מעשי של EHR. ה-</w:t>
-                </w:r>
-                <w:proofErr w:type="spellStart"/>
-                <w:r>
-                  <w:rPr>
-                    <w:rFonts w:asciiTheme="majorBidi" w:eastAsia="Times New Roman" w:hAnsiTheme="majorBidi" w:cstheme="majorBidi"/>
-                    <w:rtl/>
-                  </w:rPr>
-                  <w:t>PoC</w:t>
-                </w:r>
-                <w:proofErr w:type="spellEnd"/>
-                <w:r>
-                  <w:rPr>
-                    <w:rFonts w:asciiTheme="majorBidi" w:eastAsia="Times New Roman" w:hAnsiTheme="majorBidi" w:cstheme="majorBidi"/>
-                    <w:rtl/>
-                  </w:rPr>
-                  <w:t xml:space="preserve"> ירחיב את השיטה לחילוץ שדות נוספים של הכוונה הקלינית, יבצע אימות על טקסטים קליניים אמיתיים, מגוונים </w:t>
-                </w:r>
-                <w:proofErr w:type="spellStart"/>
-                <w:r>
-                  <w:rPr>
-                    <w:rFonts w:asciiTheme="majorBidi" w:eastAsia="Times New Roman" w:hAnsiTheme="majorBidi" w:cstheme="majorBidi"/>
-                    <w:rtl/>
-                  </w:rPr>
-                  <w:t>ומותממים</w:t>
-                </w:r>
-                <w:proofErr w:type="spellEnd"/>
-                <w:r>
-                  <w:rPr>
-                    <w:rFonts w:asciiTheme="majorBidi" w:eastAsia="Times New Roman" w:hAnsiTheme="majorBidi" w:cstheme="majorBidi"/>
-                    <w:rtl/>
-                  </w:rPr>
-                  <w:t>, וידגים אינטגרציה מבוססת FHIR/SMART. התוצר יהיה אב-טיפוס מאומת לקראת פיילוט לניהול אמין של הנחיות מעקב.</w:t>
+                  <w:t>אי-הוודאות המרכזית שנותרה היא האם השיטה עוברת באופן אמין ממאגר מבוקר לטקסט קליני אמיתי והטרוגני ויכולה להשתלב בתהליך עבודה מעשי של EHR. ה-PoC ירחיב את השיטה לחילוץ שדות נוספים של הכוונה קלינית, יבצע אימות על טקסטים קליניים אמיתיים, מגוונים ומותממים, וידגים אינטגרציה מבוססת FHIR/SMART. התוצר יהיה אב-טיפוס מאומת לקראת פיילוט לניהול אמין של הנחיות מעקב.</w:t>
                 </w:r>
               </w:p>
             </w:sdtContent>
@@ -1208,23 +1170,7 @@
                 <w:sz w:val="22"/>
                 <w:szCs w:val="22"/>
               </w:rPr>
-              <w:t>Electronic Health Record (EHR) systems capture records and structured clinical facts</w:t>
-            </w:r>
-            <w:r>
-              <w:rPr>
-                <w:rFonts w:eastAsia="Times New Roman"/>
-                <w:sz w:val="22"/>
-                <w:szCs w:val="22"/>
-              </w:rPr>
-              <w:t>. Still, a</w:t>
-            </w:r>
-            <w:r>
-              <w:rPr>
-                <w:rFonts w:eastAsia="Times New Roman"/>
-                <w:sz w:val="22"/>
-                <w:szCs w:val="22"/>
-              </w:rPr>
-              <w:t xml:space="preserve"> third operational layer often remains buried in free text: clinical intent, or what is supposed to happen next for the patient. Follow-up instructions such as “repeat the MRI in two weeks if symptoms persist” may therefore never enter the systems used to schedule, track, and audit care.</w:t>
+              <w:t>Clinicians constantly express what should happen next for a patient: order a test, repeat imaging, adjust treatment, monitor a condition, or act if specific criteria are met. Yet much of this clinical intent remains embedded in free-text notes. Electronic Health Records capture documentation and structured facts, but they do not provide a general operational layer [16] that reliably converts these intentions into actions that can be scheduled, tracked, reviewed, and audited.</w:t>
             </w:r>
           </w:p>
           <w:p>
@@ -1245,23 +1191,7 @@
                 <w:sz w:val="22"/>
                 <w:szCs w:val="22"/>
               </w:rPr>
-              <w:t xml:space="preserve">CareLoop converts such instructions into structured, source-linked, and reviewable actions. </w:t>
-            </w:r>
-            <w:r>
-              <w:rPr>
-                <w:rFonts w:eastAsia="Times New Roman"/>
-                <w:sz w:val="22"/>
-                <w:szCs w:val="22"/>
-              </w:rPr>
-              <w:t>We term this capability Clinical Intent Management (CIM): a reusable, auditable layer between heterogeneous clinical text and the workflows that act on it. Clinical intent spans referrals, orders, conditional plans, and follow-up; this PoC instantiates CIM on follow-up as its first concrete case.</w:t>
-            </w:r>
-            <w:r>
-              <w:rPr>
-                <w:rFonts w:eastAsia="Times New Roman"/>
-                <w:sz w:val="22"/>
-                <w:szCs w:val="22"/>
-              </w:rPr>
-              <w:t xml:space="preserve"> </w:t>
+              <w:t>CareLoop introduces Clinical Intent Management (CIM): a reusable, auditable layer that transforms clinical intent in heterogeneous text into structured, source-linked, and reviewable actions connected to downstream workflows. CIM supports multiple forms of intent, including orders, referrals, conditional plans, monitoring instructions, and follow-up. The proposed PoC focuses first on follow-up, where missed, delayed, or misinterpreted actions are a well-documented patient-safety and cost problem.</w:t>
             </w:r>
           </w:p>
           <w:p>
@@ -1282,7 +1212,7 @@
                 <w:sz w:val="22"/>
                 <w:szCs w:val="22"/>
               </w:rPr>
-              <w:t>CareLoop builds on the PI's neuro-symbolic method for extracting and normalizing follow-up actions and timing. The key remaining uncertainty is whether this approach transfers reliably from a controlled benchmark to heterogeneous real clinical text and can support a practical EHR workflow. The PoC will extend the method to additional intent fields, validate it on real de-identified clinical notes, reusing the PI's CIRCA annotation and FHIR-mapping assets, using a locked test and calibrated review, and demonstrate standards-based integration through FHIR/SMART workflows. The outcome will be a validated pre-pilot prototype suitable for design-partner evaluation and preparation of a real-world pilot.</w:t>
+              <w:t>CareLoop builds on the PI’s neuro-symbolic method [1] to extract and normalize clinical actions and timing. The PoC will extend the representation of clinical intent, validate it on heterogeneous de-identified clinical notes using the PI’s CIRCA [23] annotation and FHIR-mapping assets, and demonstrate standards-based integration through FHIR/SMART workflows. The outcome will be a validated CIM pre-pilot platform, demonstrated through follow-up management and ready for broader clinical-intent applications.</w:t>
             </w:r>
           </w:p>
         </w:tc>
@@ -1418,13 +1348,13 @@
                   <w:jc w:val="both"/>
                 </w:pPr>
                 <w:r>
-                  <w:t xml:space="preserve">Primary field: Artificial Intelligence (Application). CareLoop uses AI to turn free-text follow-up instructions into structured, trackable actions. The underlying method has already been developed and evaluated in the PI’s previous research. This project validates and </w:t>
-                </w:r>
-                <w:r>
-                  <w:t>productizes</w:t>
-                </w:r>
-                <w:r>
-                  <w:t xml:space="preserve"> it on real clinical text. Secondary relevance: Medicine (patient safety, continuity of care).</w:t>
+                  <w:t xml:space="preserve">Primary field: Artificial Intelligence (Application). CareLoop uses AI to turn free-text follow-up instructions into structured, trackable actions. The underlying method has already been developed and evaluated in the PI’s previous research. </w:t>
+                </w:r>
+                <w:r>
+                  <w:t>This project validates it on real clinical text and develops it into a production-ready system.</w:t>
+                </w:r>
+                <w:r>
+                  <w:t xml:space="preserve"> Secondary relevance: Medicine (patient safety, continuity of care).</w:t>
                 </w:r>
               </w:p>
             </w:tc>
@@ -4166,7 +4096,23 @@
           <w:kern w:val="0"/>
           <w14:ligatures w14:val="none"/>
         </w:rPr>
-        <w:t>Prof. Rafael Barkan</w:t>
+        <w:t>Prof. R</w:t>
+      </w:r>
+      <w:r>
+        <w:rPr>
+          <w:rFonts w:asciiTheme="majorBidi" w:eastAsia="Times New Roman" w:hAnsiTheme="majorBidi" w:cstheme="majorBidi"/>
+          <w:kern w:val="0"/>
+          <w14:ligatures w14:val="none"/>
+        </w:rPr>
+        <w:t>e</w:t>
+      </w:r>
+      <w:r>
+        <w:rPr>
+          <w:rFonts w:asciiTheme="majorBidi" w:eastAsia="Times New Roman" w:hAnsiTheme="majorBidi" w:cstheme="majorBidi"/>
+          <w:kern w:val="0"/>
+          <w14:ligatures w14:val="none"/>
+        </w:rPr>
+        <w:t>fael Barkan</w:t>
       </w:r>
     </w:p>
     <w:p>
@@ -6684,7 +6630,21 @@
                     <w:rFonts w:asciiTheme="majorBidi" w:eastAsia="Times New Roman" w:hAnsiTheme="majorBidi" w:cstheme="majorBidi"/>
                     <w:color w:val="000000"/>
                   </w:rPr>
-                  <w:t xml:space="preserve">used for candidate generation, annotation pre-labeling, and data augmentation. At the same time, the calibrated hybrid model remains the final extractor so </w:t>
+                  <w:t xml:space="preserve">used for candidate generation, annotation pre-labeling, and data augmentation. At the same time, the calibrated hybrid model remains the final </w:t>
+                </w:r>
+                <w:r>
+                  <w:rPr>
+                    <w:rFonts w:asciiTheme="majorBidi" w:eastAsia="Times New Roman" w:hAnsiTheme="majorBidi" w:cstheme="majorBidi"/>
+                    <w:color w:val="000000"/>
+                  </w:rPr>
+                  <w:t>extractor,</w:t>
+                </w:r>
+                <w:r>
+                  <w:rPr>
+                    <w:rFonts w:asciiTheme="majorBidi" w:eastAsia="Times New Roman" w:hAnsiTheme="majorBidi" w:cstheme="majorBidi"/>
+                    <w:color w:val="000000"/>
+                  </w:rPr>
+                  <w:t xml:space="preserve"> so </w:t>
                 </w:r>
                 <w:r>
                   <w:rPr>
@@ -6755,28 +6715,56 @@
                     <w:rFonts w:asciiTheme="majorBidi" w:eastAsia="Times New Roman" w:hAnsiTheme="majorBidi" w:cstheme="majorBidi"/>
                     <w:color w:val="000000"/>
                   </w:rPr>
-                  <w:t>; patients/notes are disjoint. The</w:t>
+                  <w:t xml:space="preserve">; patients/notes are </w:t>
                 </w:r>
                 <w:r>
                   <w:rPr>
                     <w:rFonts w:asciiTheme="majorBidi" w:eastAsia="Times New Roman" w:hAnsiTheme="majorBidi" w:cstheme="majorBidi"/>
                     <w:color w:val="000000"/>
                   </w:rPr>
-                  <w:t xml:space="preserve"> </w:t>
+                  <w:t>disjoint</w:t>
                 </w:r>
                 <w:r>
                   <w:rPr>
                     <w:rFonts w:asciiTheme="majorBidi" w:eastAsia="Times New Roman" w:hAnsiTheme="majorBidi" w:cstheme="majorBidi"/>
                     <w:color w:val="000000"/>
                   </w:rPr>
-                  <w:t>guidelines</w:t>
+                  <w:t>. The</w:t>
                 </w:r>
                 <w:r>
                   <w:rPr>
                     <w:rFonts w:asciiTheme="majorBidi" w:eastAsia="Times New Roman" w:hAnsiTheme="majorBidi" w:cstheme="majorBidi"/>
                     <w:color w:val="000000"/>
                   </w:rPr>
-                  <w:t>, unseen-type vocabulary, configuration, baseline prompts/rules, and confidence threshold are frozen before the test, which is never used for tuning. Experiments cover zero-adaptation transfer</w:t>
+                  <w:t xml:space="preserve"> </w:t>
+                </w:r>
+                <w:r>
+                  <w:rPr>
+                    <w:rFonts w:asciiTheme="majorBidi" w:eastAsia="Times New Roman" w:hAnsiTheme="majorBidi" w:cstheme="majorBidi"/>
+                    <w:color w:val="000000"/>
+                  </w:rPr>
+                  <w:t>guidelines</w:t>
+                </w:r>
+                <w:r>
+                  <w:rPr>
+                    <w:rFonts w:asciiTheme="majorBidi" w:eastAsia="Times New Roman" w:hAnsiTheme="majorBidi" w:cstheme="majorBidi"/>
+                    <w:color w:val="000000"/>
+                  </w:rPr>
+                  <w:t>, unseen-type vocabulary, configuration, baseline prompts/rules, and confidence threshold are frozen before the test</w:t>
+                </w:r>
+                <w:r>
+                  <w:rPr>
+                    <w:rFonts w:asciiTheme="majorBidi" w:eastAsia="Times New Roman" w:hAnsiTheme="majorBidi" w:cstheme="majorBidi"/>
+                    <w:color w:val="000000"/>
+                  </w:rPr>
+                  <w:t xml:space="preserve"> and are</w:t>
+                </w:r>
+                <w:r>
+                  <w:rPr>
+                    <w:rFonts w:asciiTheme="majorBidi" w:eastAsia="Times New Roman" w:hAnsiTheme="majorBidi" w:cstheme="majorBidi"/>
+                    <w:color w:val="000000"/>
+                  </w:rPr>
+                  <w:t xml:space="preserve"> never used for tuning. Experiments cover zero-adaptation transfer</w:t>
                 </w:r>
                 <w:r>
                   <w:rPr>
@@ -9073,8 +9061,17 @@
         <w:rPr>
           <w:rFonts w:asciiTheme="majorBidi" w:hAnsiTheme="majorBidi" w:cstheme="majorBidi"/>
         </w:rPr>
-        <w:t>Laufer, M., Aperstein, Y., &amp; Apartsin, A. (2026). Reliable Extraction of Clinical Follow-Up Instructions: A Hybrid Neural-Symbolic Pipeline. arXiv:2605.26560. https://doi.org/10.48550/arXiv.2605.26560</w:t>
-      </w:r>
+        <w:t xml:space="preserve">Laufer, M., Aperstein, Y., &amp; Apartsin, A. (2026). Reliable Extraction of Clinical Follow-Up Instructions: A Hybrid Neural-Symbolic Pipeline. arXiv:2605.26560. </w:t>
+      </w:r>
+      <w:hyperlink r:id="rId8" w:history="1">
+        <w:r>
+          <w:rPr>
+            <w:rStyle w:val="Hyperlink"/>
+            <w:rFonts w:asciiTheme="majorBidi" w:hAnsiTheme="majorBidi" w:cstheme="majorBidi"/>
+          </w:rPr>
+          <w:t>https://doi.org/10.48550/arXiv.2605.26560</w:t>
+        </w:r>
+      </w:hyperlink>
     </w:p>
     <w:p>
       <w:pPr>
@@ -9092,7 +9089,22 @@
         <w:rPr>
           <w:rFonts w:asciiTheme="majorBidi" w:hAnsiTheme="majorBidi" w:cstheme="majorBidi"/>
         </w:rPr>
-        <w:t>(*) Callen, J. L., Westbrook, J. I., Georgiou, A., &amp; Li, J. (2012). Failure to follow-up test results for ambulatory patients: a systematic review. Journal of General Internal Medicine, 27(10), 1334–1348. https://doi.org/10.1007/s11606-011-1949-5.</w:t>
+        <w:t xml:space="preserve">(*) Callen, J. L., Westbrook, J. I., Georgiou, A., &amp; Li, J. (2012). Failure to follow-up test results for ambulatory patients: a systematic review. Journal of General Internal Medicine, 27(10), 1334–1348. </w:t>
+      </w:r>
+      <w:hyperlink r:id="rId9" w:history="1">
+        <w:r>
+          <w:rPr>
+            <w:rStyle w:val="Hyperlink"/>
+            <w:rFonts w:asciiTheme="majorBidi" w:hAnsiTheme="majorBidi" w:cstheme="majorBidi"/>
+          </w:rPr>
+          <w:t>https://doi.org/10.1007/s11606-011-1949-5</w:t>
+        </w:r>
+      </w:hyperlink>
+      <w:r>
+        <w:rPr>
+          <w:rFonts w:asciiTheme="majorBidi" w:hAnsiTheme="majorBidi" w:cstheme="majorBidi"/>
+        </w:rPr>
+        <w:t>.</w:t>
       </w:r>
     </w:p>
     <w:p>
@@ -9110,8 +9122,30 @@
       <w:r>
         <w:rPr>
           <w:rFonts w:asciiTheme="majorBidi" w:hAnsiTheme="majorBidi" w:cstheme="majorBidi"/>
-        </w:rPr>
-        <w:t>Casalino, L. P., Dunham, D., Chin, M. H., et al. (2009). Frequency of failure to inform patients of clinically significant outpatient test results. Archives of Internal Medicine, 169(12), 1123–1129. https://doi.org/10.1001/archinternmed.2009.130.</w:t>
+          <w:lang w:val="pt-BR"/>
+        </w:rPr>
+        <w:t xml:space="preserve">Casalino, L. P., Dunham, D., Chin, M. H., et al. </w:t>
+      </w:r>
+      <w:r>
+        <w:rPr>
+          <w:rFonts w:asciiTheme="majorBidi" w:hAnsiTheme="majorBidi" w:cstheme="majorBidi"/>
+        </w:rPr>
+        <w:t xml:space="preserve">(2009). Frequency of failure to inform patients of clinically significant outpatient test results. Archives of Internal Medicine, 169(12), 1123–1129. </w:t>
+      </w:r>
+      <w:hyperlink r:id="rId10" w:history="1">
+        <w:r>
+          <w:rPr>
+            <w:rStyle w:val="Hyperlink"/>
+            <w:rFonts w:asciiTheme="majorBidi" w:hAnsiTheme="majorBidi" w:cstheme="majorBidi"/>
+          </w:rPr>
+          <w:t>https://doi.org/10.1001/archinternmed.2009.130</w:t>
+        </w:r>
+      </w:hyperlink>
+      <w:r>
+        <w:rPr>
+          <w:rFonts w:asciiTheme="majorBidi" w:hAnsiTheme="majorBidi" w:cstheme="majorBidi"/>
+        </w:rPr>
+        <w:t>.</w:t>
       </w:r>
     </w:p>
     <w:p>
@@ -9132,6 +9166,21 @@
         </w:rPr>
         <w:t>American College of Radiology. Recommendations Follow-Up Improvement Collaborative. ACR Learning Network. Accessed 2026.</w:t>
       </w:r>
+      <w:r>
+        <w:rPr>
+          <w:rFonts w:asciiTheme="majorBidi" w:hAnsiTheme="majorBidi" w:cstheme="majorBidi"/>
+        </w:rPr>
+        <w:t xml:space="preserve"> </w:t>
+      </w:r>
+      <w:hyperlink r:id="rId11" w:history="1">
+        <w:r>
+          <w:rPr>
+            <w:rStyle w:val="Hyperlink"/>
+            <w:rFonts w:asciiTheme="majorBidi" w:hAnsiTheme="majorBidi" w:cstheme="majorBidi"/>
+          </w:rPr>
+          <w:t>https://www.acr.org/Clinical-Resources</w:t>
+        </w:r>
+      </w:hyperlink>
     </w:p>
     <w:p>
       <w:pPr>
@@ -9149,7 +9198,22 @@
         <w:rPr>
           <w:rFonts w:asciiTheme="majorBidi" w:hAnsiTheme="majorBidi" w:cstheme="majorBidi"/>
         </w:rPr>
-        <w:t>Patel, M. P., Schettini, P., O’Leary, C. P., Bosworth, H. B., Anderson, J. B., &amp; Shah, K. P. (2018). Closing the referral loop: an analysis of primary care referrals to specialists in a large health system. Journal of General Internal Medicine, 33(5), 715–721. https://doi.org/10.1007/s11606-018-4392-z.</w:t>
+        <w:t xml:space="preserve">Patel, M. P., Schettini, P., O’Leary, C. P., Bosworth, H. B., Anderson, J. B., &amp; Shah, K. P. (2018). Closing the referral loop: an analysis of primary care referrals to specialists in a large health system. Journal of General Internal Medicine, 33(5), 715–721. </w:t>
+      </w:r>
+      <w:hyperlink r:id="rId12" w:history="1">
+        <w:r>
+          <w:rPr>
+            <w:rStyle w:val="Hyperlink"/>
+            <w:rFonts w:asciiTheme="majorBidi" w:hAnsiTheme="majorBidi" w:cstheme="majorBidi"/>
+          </w:rPr>
+          <w:t>https://doi.org/10.1007/s11606-018-4392-z</w:t>
+        </w:r>
+      </w:hyperlink>
+      <w:r>
+        <w:rPr>
+          <w:rFonts w:asciiTheme="majorBidi" w:hAnsiTheme="majorBidi" w:cstheme="majorBidi"/>
+        </w:rPr>
+        <w:t>.</w:t>
       </w:r>
     </w:p>
     <w:p>
@@ -9168,36 +9232,17 @@
         <w:rPr>
           <w:rFonts w:asciiTheme="majorBidi" w:hAnsiTheme="majorBidi" w:cstheme="majorBidi"/>
         </w:rPr>
-        <w:t>Cohen-</w:t>
-      </w:r>
-      <w:proofErr w:type="spellStart"/>
-      <w:r>
-        <w:rPr>
-          <w:rFonts w:asciiTheme="majorBidi" w:hAnsiTheme="majorBidi" w:cstheme="majorBidi"/>
-        </w:rPr>
-        <w:t>Yatziv</w:t>
-      </w:r>
-      <w:proofErr w:type="spellEnd"/>
-      <w:r>
-        <w:rPr>
-          <w:rFonts w:asciiTheme="majorBidi" w:hAnsiTheme="majorBidi" w:cstheme="majorBidi"/>
-        </w:rPr>
-        <w:t xml:space="preserve">, L., Cohen, M. J., Halevy, J., &amp; </w:t>
-      </w:r>
-      <w:proofErr w:type="spellStart"/>
-      <w:r>
-        <w:rPr>
-          <w:rFonts w:asciiTheme="majorBidi" w:hAnsiTheme="majorBidi" w:cstheme="majorBidi"/>
-        </w:rPr>
-        <w:t>Kaliner</w:t>
-      </w:r>
-      <w:proofErr w:type="spellEnd"/>
-      <w:r>
-        <w:rPr>
-          <w:rFonts w:asciiTheme="majorBidi" w:hAnsiTheme="majorBidi" w:cstheme="majorBidi"/>
-        </w:rPr>
-        <w:t>, E. (2019). No-shows in ambulatory clinics and non-utilized appointments for elective operations in selected surgical departments at a tertiary hospital in Israel. Israel Journal of Health Policy Research, 8, 64. https://doi.org/10.1186/s13584-019-0333-5</w:t>
-      </w:r>
+        <w:t xml:space="preserve">Cohen-Yatziv, L., Cohen, M. J., Halevy, J., &amp; Kaliner, E. (2019). No-shows in ambulatory clinics and non-utilized appointments for elective operations in selected surgical departments at a tertiary hospital in Israel. Israel Journal of Health Policy Research, 8, 64. </w:t>
+      </w:r>
+      <w:hyperlink r:id="rId13" w:history="1">
+        <w:r>
+          <w:rPr>
+            <w:rStyle w:val="Hyperlink"/>
+            <w:rFonts w:asciiTheme="majorBidi" w:hAnsiTheme="majorBidi" w:cstheme="majorBidi"/>
+          </w:rPr>
+          <w:t>https://doi.org/10.1186/s13584-019-0333-5</w:t>
+        </w:r>
+      </w:hyperlink>
     </w:p>
     <w:p>
       <w:pPr>
@@ -9215,7 +9260,22 @@
         <w:rPr>
           <w:rFonts w:asciiTheme="majorBidi" w:hAnsiTheme="majorBidi" w:cstheme="majorBidi"/>
         </w:rPr>
-        <w:t>Friedman, C., Shagina, L., Lussier, Y., &amp; Hripcsak, G. (2004). Automated encoding of clinical documents based on natural language processing. Journal of the American Medical Informatics Association, 11(5), 392–402. https://doi.org/10.1197/jamia.M1552.</w:t>
+        <w:t xml:space="preserve">Friedman, C., Shagina, L., Lussier, Y., &amp; Hripcsak, G. (2004). Automated encoding of clinical documents based on natural language processing. Journal of the American Medical Informatics Association, 11(5), 392–402. </w:t>
+      </w:r>
+      <w:hyperlink r:id="rId14" w:history="1">
+        <w:r>
+          <w:rPr>
+            <w:rStyle w:val="Hyperlink"/>
+            <w:rFonts w:asciiTheme="majorBidi" w:hAnsiTheme="majorBidi" w:cstheme="majorBidi"/>
+          </w:rPr>
+          <w:t>https://doi.org/10.1197/jamia.M1552</w:t>
+        </w:r>
+      </w:hyperlink>
+      <w:r>
+        <w:rPr>
+          <w:rFonts w:asciiTheme="majorBidi" w:hAnsiTheme="majorBidi" w:cstheme="majorBidi"/>
+        </w:rPr>
+        <w:t>.</w:t>
       </w:r>
     </w:p>
     <w:p>
@@ -9234,21 +9294,22 @@
         <w:rPr>
           <w:rFonts w:asciiTheme="majorBidi" w:hAnsiTheme="majorBidi" w:cstheme="majorBidi"/>
         </w:rPr>
-        <w:t>Savova, G. K., Masanz, J. J., Ogren, P. V., et al. (2010). Mayo Clinical Text Analysis and Knowledge Extraction System (</w:t>
-      </w:r>
-      <w:proofErr w:type="spellStart"/>
-      <w:r>
-        <w:rPr>
-          <w:rFonts w:asciiTheme="majorBidi" w:hAnsiTheme="majorBidi" w:cstheme="majorBidi"/>
-        </w:rPr>
-        <w:t>cTAKES</w:t>
-      </w:r>
-      <w:proofErr w:type="spellEnd"/>
-      <w:r>
-        <w:rPr>
-          <w:rFonts w:asciiTheme="majorBidi" w:hAnsiTheme="majorBidi" w:cstheme="majorBidi"/>
-        </w:rPr>
-        <w:t>): architecture, component evaluation and applications. Journal of the American Medical Informatics Association, 17(5), 507–513. https://doi.org/10.1136/jamia.2009.001560.</w:t>
+        <w:t xml:space="preserve">Savova, G. K., Masanz, J. J., Ogren, P. V., et al. (2010). Mayo Clinical Text Analysis and Knowledge Extraction System (cTAKES): architecture, component evaluation and applications. Journal of the American Medical Informatics Association, 17(5), 507–513. </w:t>
+      </w:r>
+      <w:hyperlink r:id="rId15" w:history="1">
+        <w:r>
+          <w:rPr>
+            <w:rStyle w:val="Hyperlink"/>
+            <w:rFonts w:asciiTheme="majorBidi" w:hAnsiTheme="majorBidi" w:cstheme="majorBidi"/>
+          </w:rPr>
+          <w:t>https://doi.org/10.1136/jamia.2009.001560</w:t>
+        </w:r>
+      </w:hyperlink>
+      <w:r>
+        <w:rPr>
+          <w:rFonts w:asciiTheme="majorBidi" w:hAnsiTheme="majorBidi" w:cstheme="majorBidi"/>
+        </w:rPr>
+        <w:t>.</w:t>
       </w:r>
     </w:p>
     <w:p>
@@ -9267,7 +9328,22 @@
         <w:rPr>
           <w:rFonts w:asciiTheme="majorBidi" w:hAnsiTheme="majorBidi" w:cstheme="majorBidi"/>
         </w:rPr>
-        <w:t>Soysal, E., Wang, J., Jiang, M., et al. (2018). CLAMP: a toolkit for efficiently building customized clinical natural language processing pipelines. Journal of the American Medical Informatics Association, 25(3), 331–336. https://doi.org/10.1093/jamia/ocx132.</w:t>
+        <w:t xml:space="preserve">Soysal, E., Wang, J., Jiang, M., et al. (2018). CLAMP: a toolkit for efficiently building customized clinical natural language processing pipelines. Journal of the American Medical Informatics Association, 25(3), 331–336. </w:t>
+      </w:r>
+      <w:hyperlink r:id="rId16" w:history="1">
+        <w:r>
+          <w:rPr>
+            <w:rStyle w:val="Hyperlink"/>
+            <w:rFonts w:asciiTheme="majorBidi" w:hAnsiTheme="majorBidi" w:cstheme="majorBidi"/>
+          </w:rPr>
+          <w:t>https://doi.org/10.1093/jamia/ocx132</w:t>
+        </w:r>
+      </w:hyperlink>
+      <w:r>
+        <w:rPr>
+          <w:rFonts w:asciiTheme="majorBidi" w:hAnsiTheme="majorBidi" w:cstheme="majorBidi"/>
+        </w:rPr>
+        <w:t>.</w:t>
       </w:r>
     </w:p>
     <w:p>
@@ -9286,7 +9362,22 @@
         <w:rPr>
           <w:rFonts w:asciiTheme="majorBidi" w:hAnsiTheme="majorBidi" w:cstheme="majorBidi"/>
         </w:rPr>
-        <w:t>Shah, S. J., Cronin, P., Hong, C. S., et al. (2016). Targeted reminder phone calls to patients at high risk of no-show for primary care appointment: a randomized trial. Journal of General Internal Medicine, 31(12), 1460–1466. https://doi.org/10.1007/s11606-016-3813-0.</w:t>
+        <w:t xml:space="preserve">Shah, S. J., Cronin, P., Hong, C. S., et al. (2016). Targeted reminder phone calls to patients at high risk of no-show for primary care appointment: a randomized trial. Journal of General Internal Medicine, 31(12), 1460–1466. </w:t>
+      </w:r>
+      <w:hyperlink r:id="rId17" w:history="1">
+        <w:r>
+          <w:rPr>
+            <w:rStyle w:val="Hyperlink"/>
+            <w:rFonts w:asciiTheme="majorBidi" w:hAnsiTheme="majorBidi" w:cstheme="majorBidi"/>
+          </w:rPr>
+          <w:t>https://doi.org/10.1007/s11606-016-3813-0</w:t>
+        </w:r>
+      </w:hyperlink>
+      <w:r>
+        <w:rPr>
+          <w:rFonts w:asciiTheme="majorBidi" w:hAnsiTheme="majorBidi" w:cstheme="majorBidi"/>
+        </w:rPr>
+        <w:t>.</w:t>
       </w:r>
     </w:p>
     <w:p>
@@ -9305,7 +9396,22 @@
         <w:rPr>
           <w:rFonts w:asciiTheme="majorBidi" w:hAnsiTheme="majorBidi" w:cstheme="majorBidi"/>
         </w:rPr>
-        <w:t>Newman-Toker, D. E., Nassery, N., Schaffer, A. C., et al. (2024). Burden of serious harms from diagnostic error in the USA. BMJ Quality &amp; Safety, 33(2), 109–120. https://doi.org/10.1136/bmjqs-2021-014130.</w:t>
+        <w:t>Newman-Toker, D. E., Nassery, N., Schaffer, A. C., et al. (2024). Burden of serious harms from diagnostic error in the USA. BMJ Quality &amp; Safety, 33(2), 109–120</w:t>
+      </w:r>
+      <w:hyperlink r:id="rId18" w:history="1">
+        <w:r>
+          <w:rPr>
+            <w:rStyle w:val="Hyperlink"/>
+            <w:rFonts w:asciiTheme="majorBidi" w:hAnsiTheme="majorBidi" w:cstheme="majorBidi"/>
+          </w:rPr>
+          <w:t>. https://doi.org/10.1136/bmjqs-2021-014130</w:t>
+        </w:r>
+      </w:hyperlink>
+      <w:r>
+        <w:rPr>
+          <w:rFonts w:asciiTheme="majorBidi" w:hAnsiTheme="majorBidi" w:cstheme="majorBidi"/>
+        </w:rPr>
+        <w:t>.</w:t>
       </w:r>
     </w:p>
     <w:p>
@@ -9324,21 +9430,22 @@
         <w:rPr>
           <w:rFonts w:asciiTheme="majorBidi" w:hAnsiTheme="majorBidi" w:cstheme="majorBidi"/>
         </w:rPr>
-        <w:t>(*) Zaki-</w:t>
-      </w:r>
-      <w:proofErr w:type="spellStart"/>
-      <w:r>
-        <w:rPr>
-          <w:rFonts w:asciiTheme="majorBidi" w:hAnsiTheme="majorBidi" w:cstheme="majorBidi"/>
-        </w:rPr>
-        <w:t>Metias</w:t>
-      </w:r>
-      <w:proofErr w:type="spellEnd"/>
-      <w:r>
-        <w:rPr>
-          <w:rFonts w:asciiTheme="majorBidi" w:hAnsiTheme="majorBidi" w:cstheme="majorBidi"/>
-        </w:rPr>
-        <w:t>, K. M., MacLean, J. J., Satei, A. M., et al. (2023). The FIND Program: improving follow-up of incidental imaging findings. Journal of Digital Imaging, 36, 804–811. https://doi.org/10.1007/s10278-023-00780-6.</w:t>
+        <w:t xml:space="preserve">(*) Zaki-Metias, K. M., MacLean, J. J., Satei, A. M., et al. (2023). The FIND Program: improving follow-up of incidental imaging findings. Journal of Digital Imaging, 36, 804–811. </w:t>
+      </w:r>
+      <w:hyperlink r:id="rId19" w:history="1">
+        <w:r>
+          <w:rPr>
+            <w:rStyle w:val="Hyperlink"/>
+            <w:rFonts w:asciiTheme="majorBidi" w:hAnsiTheme="majorBidi" w:cstheme="majorBidi"/>
+          </w:rPr>
+          <w:t>https://doi.org/10.1007/s10278-023-00780-6</w:t>
+        </w:r>
+      </w:hyperlink>
+      <w:r>
+        <w:rPr>
+          <w:rFonts w:asciiTheme="majorBidi" w:hAnsiTheme="majorBidi" w:cstheme="majorBidi"/>
+        </w:rPr>
+        <w:t>.</w:t>
       </w:r>
     </w:p>
     <w:p>
@@ -9357,21 +9464,22 @@
         <w:rPr>
           <w:rFonts w:asciiTheme="majorBidi" w:hAnsiTheme="majorBidi" w:cstheme="majorBidi"/>
         </w:rPr>
-        <w:t xml:space="preserve">(*) Mullenbach, J., </w:t>
-      </w:r>
-      <w:proofErr w:type="spellStart"/>
-      <w:r>
-        <w:rPr>
-          <w:rFonts w:asciiTheme="majorBidi" w:hAnsiTheme="majorBidi" w:cstheme="majorBidi"/>
-        </w:rPr>
-        <w:t>Pruksachatkun</w:t>
-      </w:r>
-      <w:proofErr w:type="spellEnd"/>
-      <w:r>
-        <w:rPr>
-          <w:rFonts w:asciiTheme="majorBidi" w:hAnsiTheme="majorBidi" w:cstheme="majorBidi"/>
-        </w:rPr>
-        <w:t>, Y., Adler, S., et al. (2021). CLIP: a dataset for extracting action items for physicians from hospital discharge notes. Proceedings of ACL-IJCNLP, 1365–1378. Dataset version 1.0.0, PhysioNet, https://doi.org/10.13026/kw00-z903.</w:t>
+        <w:t xml:space="preserve">(*) Mullenbach, J., Pruksachatkun, Y., Adler, S., et al. (2021). CLIP: a dataset for extracting action items for physicians from hospital discharge notes. Proceedings of ACL-IJCNLP, 1365–1378. Dataset version 1.0.0, PhysioNet, </w:t>
+      </w:r>
+      <w:hyperlink r:id="rId20" w:history="1">
+        <w:r>
+          <w:rPr>
+            <w:rStyle w:val="Hyperlink"/>
+            <w:rFonts w:asciiTheme="majorBidi" w:hAnsiTheme="majorBidi" w:cstheme="majorBidi"/>
+          </w:rPr>
+          <w:t>https://doi.org/10.13026/kw00-z903</w:t>
+        </w:r>
+      </w:hyperlink>
+      <w:r>
+        <w:rPr>
+          <w:rFonts w:asciiTheme="majorBidi" w:hAnsiTheme="majorBidi" w:cstheme="majorBidi"/>
+        </w:rPr>
+        <w:t>.</w:t>
       </w:r>
     </w:p>
     <w:p>
@@ -9391,7 +9499,22 @@
           <w:rFonts w:asciiTheme="majorBidi" w:hAnsiTheme="majorBidi" w:cstheme="majorBidi"/>
         </w:rPr>
         <w:lastRenderedPageBreak/>
-        <w:t>Johnson, A., Pollard, T., Horng, S., Celi, L. A., &amp; Mark, R. (2023). MIMIC-IV-Note: de-identified free-text clinical notes (version 2.2). PhysioNet. https://doi.org/10.13026/1n74-ne17.</w:t>
+        <w:t xml:space="preserve">Johnson, A., Pollard, T., Horng, S., Celi, L. A., &amp; Mark, R. (2023). MIMIC-IV-Note: de-identified free-text clinical notes (version 2.2). PhysioNet. </w:t>
+      </w:r>
+      <w:hyperlink r:id="rId21" w:history="1">
+        <w:r>
+          <w:rPr>
+            <w:rStyle w:val="Hyperlink"/>
+            <w:rFonts w:asciiTheme="majorBidi" w:hAnsiTheme="majorBidi" w:cstheme="majorBidi"/>
+          </w:rPr>
+          <w:t>https://doi.org/10.13026/1n74-ne17</w:t>
+        </w:r>
+      </w:hyperlink>
+      <w:r>
+        <w:rPr>
+          <w:rFonts w:asciiTheme="majorBidi" w:hAnsiTheme="majorBidi" w:cstheme="majorBidi"/>
+        </w:rPr>
+        <w:t>.</w:t>
       </w:r>
     </w:p>
     <w:p>
@@ -9410,21 +9533,22 @@
         <w:rPr>
           <w:rFonts w:asciiTheme="majorBidi" w:hAnsiTheme="majorBidi" w:cstheme="majorBidi"/>
         </w:rPr>
-        <w:t xml:space="preserve">(*) Sun, W., Rumshisky, A., &amp; </w:t>
-      </w:r>
-      <w:proofErr w:type="spellStart"/>
-      <w:r>
-        <w:rPr>
-          <w:rFonts w:asciiTheme="majorBidi" w:hAnsiTheme="majorBidi" w:cstheme="majorBidi"/>
-        </w:rPr>
-        <w:t>Uzuner</w:t>
-      </w:r>
-      <w:proofErr w:type="spellEnd"/>
-      <w:r>
-        <w:rPr>
-          <w:rFonts w:asciiTheme="majorBidi" w:hAnsiTheme="majorBidi" w:cstheme="majorBidi"/>
-        </w:rPr>
-        <w:t>, Ö. (2013). Evaluating temporal relations in clinical text: 2012 i2b2 Challenge. Journal of the American Medical Informatics Association, 20(5), 806–813. https://doi.org/10.1136/amiajnl-2013-001628.</w:t>
+        <w:t xml:space="preserve">(*) Sun, W., Rumshisky, A., &amp; Uzuner, Ö. (2013). Evaluating temporal relations in clinical text: 2012 i2b2 Challenge. Journal of the American Medical Informatics Association, 20(5), 806–813. </w:t>
+      </w:r>
+      <w:hyperlink r:id="rId22" w:history="1">
+        <w:r>
+          <w:rPr>
+            <w:rStyle w:val="Hyperlink"/>
+            <w:rFonts w:asciiTheme="majorBidi" w:hAnsiTheme="majorBidi" w:cstheme="majorBidi"/>
+          </w:rPr>
+          <w:t>https://doi.org/10.1136/amiajnl-2013-001628</w:t>
+        </w:r>
+      </w:hyperlink>
+      <w:r>
+        <w:rPr>
+          <w:rFonts w:asciiTheme="majorBidi" w:hAnsiTheme="majorBidi" w:cstheme="majorBidi"/>
+        </w:rPr>
+        <w:t>.</w:t>
       </w:r>
     </w:p>
     <w:p>
@@ -9443,8 +9567,17 @@
         <w:rPr>
           <w:rFonts w:asciiTheme="majorBidi" w:hAnsiTheme="majorBidi" w:cstheme="majorBidi"/>
         </w:rPr>
-        <w:t>Apartsin, A., &amp; Aperstein, Y. (2026). Three Generations of Healthcare IT: From the Digital Record to the Computable Care Process. arXiv:2608.08806. https://doi.org/10.48550/arXiv.2608.08806</w:t>
-      </w:r>
+        <w:t xml:space="preserve">Apartsin, A., &amp; Aperstein, Y. (2026). Three Generations of Healthcare IT: From the Digital Record to the Computable Care Process. arXiv:2608.08806. </w:t>
+      </w:r>
+      <w:hyperlink r:id="rId23" w:history="1">
+        <w:r>
+          <w:rPr>
+            <w:rStyle w:val="Hyperlink"/>
+            <w:rFonts w:asciiTheme="majorBidi" w:hAnsiTheme="majorBidi" w:cstheme="majorBidi"/>
+          </w:rPr>
+          <w:t>https://doi.org/10.48550/arXiv.2608.08806</w:t>
+        </w:r>
+      </w:hyperlink>
     </w:p>
     <w:p>
       <w:pPr>
@@ -9462,8 +9595,24 @@
         <w:rPr>
           <w:rFonts w:asciiTheme="majorBidi" w:hAnsiTheme="majorBidi" w:cstheme="majorBidi"/>
         </w:rPr>
-        <w:t>Health Level Seven International. FHIR Release 4 (R4): Task, ServiceRequest, CarePlan, CommunicationRequest, and Provenance. HL7 FHIR v4.0.1.</w:t>
-      </w:r>
+        <w:t>Health Level Seven International. FHIR Release 4 (R4): Task, ServiceRequest, CarePlan, CommunicationRequest, and Provenance. HL7 FHIR v4.0.1</w:t>
+      </w:r>
+      <w:hyperlink r:id="rId24" w:history="1">
+        <w:r>
+          <w:rPr>
+            <w:rStyle w:val="Hyperlink"/>
+            <w:rFonts w:asciiTheme="majorBidi" w:hAnsiTheme="majorBidi" w:cstheme="majorBidi"/>
+          </w:rPr>
+          <w:t>.</w:t>
+        </w:r>
+        <w:r>
+          <w:rPr>
+            <w:rStyle w:val="Hyperlink"/>
+            <w:rFonts w:asciiTheme="majorBidi" w:hAnsiTheme="majorBidi" w:cstheme="majorBidi"/>
+          </w:rPr>
+          <w:t xml:space="preserve"> https://hl7.org/fhir/R4/index.html</w:t>
+        </w:r>
+      </w:hyperlink>
     </w:p>
     <w:p>
       <w:pPr>
@@ -9481,8 +9630,24 @@
         <w:rPr>
           <w:rFonts w:asciiTheme="majorBidi" w:hAnsiTheme="majorBidi" w:cstheme="majorBidi"/>
         </w:rPr>
-        <w:t>Health Level Seven International. CDS Hooks Specification and SMART App Launch Implementation Guide; Office of the National Coordinator for Health IT. Inferno FHIR Conformance Testing.</w:t>
-      </w:r>
+        <w:t xml:space="preserve">Health Level Seven International. CDS Hooks Specification and SMART App Launch Implementation Guide; </w:t>
+      </w:r>
+      <w:hyperlink r:id="rId25" w:history="1">
+        <w:r>
+          <w:rPr>
+            <w:rStyle w:val="Hyperlink"/>
+            <w:rFonts w:asciiTheme="majorBidi" w:hAnsiTheme="majorBidi" w:cstheme="majorBidi"/>
+          </w:rPr>
+          <w:t>https://cds-hooks.org/</w:t>
+        </w:r>
+        <w:r>
+          <w:rPr>
+            <w:rStyle w:val="Hyperlink"/>
+            <w:rFonts w:asciiTheme="majorBidi" w:hAnsiTheme="majorBidi" w:cstheme="majorBidi"/>
+          </w:rPr>
+          <w:t>.</w:t>
+        </w:r>
+      </w:hyperlink>
     </w:p>
     <w:p>
       <w:pPr>
@@ -9500,22 +9665,17 @@
         <w:rPr>
           <w:rFonts w:asciiTheme="majorBidi" w:hAnsiTheme="majorBidi" w:cstheme="majorBidi"/>
         </w:rPr>
-        <w:t xml:space="preserve">(*) O’Connor, S. D., </w:t>
-      </w:r>
-      <w:proofErr w:type="spellStart"/>
-      <w:r>
-        <w:rPr>
-          <w:rFonts w:asciiTheme="majorBidi" w:hAnsiTheme="majorBidi" w:cstheme="majorBidi"/>
-        </w:rPr>
-        <w:t>Alkasab</w:t>
-      </w:r>
-      <w:proofErr w:type="spellEnd"/>
-      <w:r>
-        <w:rPr>
-          <w:rFonts w:asciiTheme="majorBidi" w:hAnsiTheme="majorBidi" w:cstheme="majorBidi"/>
-        </w:rPr>
-        <w:t>, T., Samuel, J. K. R., &amp; Sippo, D. A. (2026). The Potential Role of Artificial Intelligence in Systematic Follow-Up Recommendation Tracking and Outcome Assessment. Journal of the American College of Radiology, 23(3), 410–420. https://doi.org/10.1016/j.jacr.2025.10.019</w:t>
-      </w:r>
+        <w:t xml:space="preserve">(*) O’Connor, S. D., Alkasab, T., Samuel, J. K. R., &amp; Sippo, D. A. (2026). The Potential Role of Artificial Intelligence in Systematic Follow-Up Recommendation Tracking and Outcome Assessment. Journal of the American College of Radiology, 23(3), 410–420. </w:t>
+      </w:r>
+      <w:hyperlink r:id="rId26" w:history="1">
+        <w:r>
+          <w:rPr>
+            <w:rStyle w:val="Hyperlink"/>
+            <w:rFonts w:asciiTheme="majorBidi" w:hAnsiTheme="majorBidi" w:cstheme="majorBidi"/>
+          </w:rPr>
+          <w:t>https://doi.org/10.1016/j.jacr.2025.10.019</w:t>
+        </w:r>
+      </w:hyperlink>
     </w:p>
     <w:p>
       <w:pPr>
@@ -9533,49 +9693,29 @@
         <w:rPr>
           <w:rFonts w:asciiTheme="majorBidi" w:hAnsiTheme="majorBidi" w:cstheme="majorBidi"/>
         </w:rPr>
-        <w:t xml:space="preserve">Centers for Medicare &amp; Medicaid Services. Closing the Referral Loop: Receipt of Specialist Report. Quality ID 374; </w:t>
-      </w:r>
-      <w:proofErr w:type="spellStart"/>
-      <w:r>
-        <w:rPr>
-          <w:rFonts w:asciiTheme="majorBidi" w:hAnsiTheme="majorBidi" w:cstheme="majorBidi"/>
-        </w:rPr>
-        <w:t>eCQM</w:t>
-      </w:r>
-      <w:proofErr w:type="spellEnd"/>
-      <w:r>
-        <w:rPr>
-          <w:rFonts w:asciiTheme="majorBidi" w:hAnsiTheme="majorBidi" w:cstheme="majorBidi"/>
-        </w:rPr>
-        <w:t xml:space="preserve"> CMS50v12. qpp.cms.gov/</w:t>
-      </w:r>
-      <w:proofErr w:type="spellStart"/>
-      <w:r>
-        <w:rPr>
-          <w:rFonts w:asciiTheme="majorBidi" w:hAnsiTheme="majorBidi" w:cstheme="majorBidi"/>
-        </w:rPr>
-        <w:t>mips</w:t>
-      </w:r>
-      <w:proofErr w:type="spellEnd"/>
-      <w:r>
-        <w:rPr>
-          <w:rFonts w:asciiTheme="majorBidi" w:hAnsiTheme="majorBidi" w:cstheme="majorBidi"/>
-        </w:rPr>
-        <w:t>/explore-measures/</w:t>
-      </w:r>
-      <w:proofErr w:type="spellStart"/>
-      <w:r>
-        <w:rPr>
-          <w:rFonts w:asciiTheme="majorBidi" w:hAnsiTheme="majorBidi" w:cstheme="majorBidi"/>
-        </w:rPr>
-        <w:t>ecqm</w:t>
-      </w:r>
-      <w:proofErr w:type="spellEnd"/>
-      <w:r>
-        <w:rPr>
-          <w:rFonts w:asciiTheme="majorBidi" w:hAnsiTheme="majorBidi" w:cstheme="majorBidi"/>
-        </w:rPr>
-        <w:t>/CMS50v12 (accessed 2026).</w:t>
+        <w:t>Centers for Medicare &amp; Medicaid Services. Closing the Referral Loop: Receipt of Specialist Report. Quality ID 374; eCQM CMS50v12</w:t>
+      </w:r>
+      <w:hyperlink r:id="rId27" w:history="1">
+        <w:r>
+          <w:rPr>
+            <w:rStyle w:val="Hyperlink"/>
+            <w:rFonts w:asciiTheme="majorBidi" w:hAnsiTheme="majorBidi" w:cstheme="majorBidi"/>
+          </w:rPr>
+          <w:t xml:space="preserve">. </w:t>
+        </w:r>
+        <w:r>
+          <w:rPr>
+            <w:rStyle w:val="Hyperlink"/>
+            <w:rFonts w:asciiTheme="majorBidi" w:hAnsiTheme="majorBidi" w:cstheme="majorBidi"/>
+          </w:rPr>
+          <w:t>https://ecqi.healthit.gov/ecqm/ec/2026/cms0050v14</w:t>
+        </w:r>
+      </w:hyperlink>
+      <w:r>
+        <w:rPr>
+          <w:rFonts w:asciiTheme="majorBidi" w:hAnsiTheme="majorBidi" w:cstheme="majorBidi"/>
+        </w:rPr>
+        <w:t>(accessed 2026).</w:t>
       </w:r>
     </w:p>
     <w:p>
@@ -9594,21 +9734,22 @@
         <w:rPr>
           <w:rFonts w:asciiTheme="majorBidi" w:hAnsiTheme="majorBidi" w:cstheme="majorBidi"/>
         </w:rPr>
-        <w:t>Microsoft. PowerScribe One: Follow-Up Recommendations. support.microsoft.com/</w:t>
-      </w:r>
-      <w:proofErr w:type="spellStart"/>
-      <w:r>
-        <w:rPr>
-          <w:rFonts w:asciiTheme="majorBidi" w:hAnsiTheme="majorBidi" w:cstheme="majorBidi"/>
-        </w:rPr>
-        <w:t>powerscribe</w:t>
-      </w:r>
-      <w:proofErr w:type="spellEnd"/>
-      <w:r>
-        <w:rPr>
-          <w:rFonts w:asciiTheme="majorBidi" w:hAnsiTheme="majorBidi" w:cstheme="majorBidi"/>
-        </w:rPr>
-        <w:t>-one/follow-up-recommendations (accessed 2026).</w:t>
+        <w:t xml:space="preserve">Microsoft. PowerScribe One: Follow-Up Recommendations. </w:t>
+      </w:r>
+      <w:hyperlink r:id="rId28" w:history="1">
+        <w:r>
+          <w:rPr>
+            <w:rStyle w:val="Hyperlink"/>
+            <w:rFonts w:asciiTheme="majorBidi" w:hAnsiTheme="majorBidi" w:cstheme="majorBidi"/>
+          </w:rPr>
+          <w:t>https://support.microsoft.com/en-us/powerscribe-one/follow-up-recommendations</w:t>
+        </w:r>
+      </w:hyperlink>
+      <w:r>
+        <w:rPr>
+          <w:rFonts w:asciiTheme="majorBidi" w:hAnsiTheme="majorBidi" w:cstheme="majorBidi"/>
+        </w:rPr>
+        <w:t>(accessed 2026).</w:t>
       </w:r>
     </w:p>
     <w:p>
@@ -9629,7 +9770,7 @@
         </w:rPr>
         <w:t xml:space="preserve">Apartsin, A., &amp; Aperstein, Y. (2026). Clinical Communication Processing with Models Trained on LLM-Generated Synthetic Data: A Structured Survey and Novel Application Case Studies. arXiv:2608.05993. </w:t>
       </w:r>
-      <w:hyperlink r:id="rId8" w:history="1">
+      <w:hyperlink r:id="rId29" w:history="1">
         <w:r>
           <w:rPr>
             <w:rStyle w:val="Hyperlink"/>
@@ -9655,8 +9796,24 @@
         <w:rPr>
           <w:rFonts w:asciiTheme="majorBidi" w:hAnsiTheme="majorBidi" w:cstheme="majorBidi"/>
         </w:rPr>
-        <w:t>Apartsin, A., &amp; Aperstein, Y. (2026). Clinical Intent Extraction: A FHIR-Aligned Representation and the CIRCA Benchmark. Manuscript submitted for peer review.</w:t>
-      </w:r>
+        <w:t xml:space="preserve">Apartsin, A., &amp; Aperstein, Y. (2026). Clinical Intent Extraction: A FHIR-Aligned Representation and the CIRCA Benchmark. </w:t>
+      </w:r>
+      <w:r>
+        <w:rPr>
+          <w:rFonts w:asciiTheme="majorBidi" w:hAnsiTheme="majorBidi" w:cstheme="majorBidi"/>
+        </w:rPr>
+        <w:t xml:space="preserve">Preprint, </w:t>
+      </w:r>
+      <w:hyperlink r:id="rId30" w:history="1">
+        <w:r>
+          <w:rPr>
+            <w:rStyle w:val="Hyperlink"/>
+            <w:rFonts w:asciiTheme="majorBidi" w:hAnsiTheme="majorBidi" w:cstheme="majorBidi"/>
+            <w:lang w:val="en-IL"/>
+          </w:rPr>
+          <w:t>https://doi.org/10.13140/RG.2.2.28773.97760</w:t>
+        </w:r>
+      </w:hyperlink>
     </w:p>
     <w:p>
       <w:pPr>
@@ -10796,7 +10953,7 @@
         </w:rPr>
         <w:t xml:space="preserve">A substantial part of my current and previous work, in both academia and industry, has focused on reliably extracting and processing information from text using natural language processing, machine learning, and, more recently, LLMs. Further details are available at </w:t>
       </w:r>
-      <w:hyperlink r:id="rId9" w:history="1">
+      <w:hyperlink r:id="rId31" w:history="1">
         <w:r>
           <w:rPr>
             <w:rStyle w:val="Hyperlink"/>
@@ -11329,7 +11486,7 @@
         </w:rPr>
         <w:t xml:space="preserve"> arXiv:2605.26560,  </w:t>
       </w:r>
-      <w:hyperlink r:id="rId10" w:history="1">
+      <w:hyperlink r:id="rId32" w:history="1">
         <w:r>
           <w:rPr>
             <w:rStyle w:val="Hyperlink"/>
@@ -11342,31 +11499,7 @@
         <w:rPr>
           <w:rFonts w:asciiTheme="majorBidi" w:hAnsiTheme="majorBidi" w:cstheme="majorBidi"/>
         </w:rPr>
-        <w:t>. (</w:t>
-      </w:r>
-      <w:r>
-        <w:rPr>
-          <w:rFonts w:asciiTheme="majorBidi" w:hAnsiTheme="majorBidi" w:cstheme="majorBidi"/>
-          <w:i/>
-          <w:iCs/>
-        </w:rPr>
-        <w:t>Not yet peer-reviewed</w:t>
-      </w:r>
-      <w:r>
-        <w:rPr>
-          <w:rFonts w:asciiTheme="majorBidi" w:hAnsiTheme="majorBidi" w:cstheme="majorBidi"/>
-          <w:i/>
-          <w:iCs/>
-        </w:rPr>
-        <w:t>;</w:t>
-      </w:r>
-      <w:r>
-        <w:rPr>
-          <w:rFonts w:asciiTheme="majorBidi" w:hAnsiTheme="majorBidi" w:cstheme="majorBidi"/>
-          <w:i/>
-          <w:iCs/>
-        </w:rPr>
-        <w:t xml:space="preserve"> submitted for peer review; scientific basis for the proposal.)</w:t>
+        <w:t xml:space="preserve">. </w:t>
       </w:r>
     </w:p>
     <w:p>
@@ -11385,6 +11518,7 @@
       <w:r>
         <w:rPr>
           <w:rFonts w:asciiTheme="majorBidi" w:hAnsiTheme="majorBidi" w:cstheme="majorBidi"/>
+          <w:lang w:val="pt-BR"/>
         </w:rPr>
         <w:t xml:space="preserve">Atia, T., Aperstein, Y., &amp; </w:t>
       </w:r>
@@ -11392,16 +11526,24 @@
         <w:rPr>
           <w:rFonts w:asciiTheme="majorBidi" w:hAnsiTheme="majorBidi" w:cstheme="majorBidi"/>
           <w:u w:val="single"/>
+          <w:lang w:val="pt-BR"/>
         </w:rPr>
         <w:t>Apartsin</w:t>
       </w:r>
       <w:r>
         <w:rPr>
           <w:rFonts w:asciiTheme="majorBidi" w:hAnsiTheme="majorBidi" w:cstheme="majorBidi"/>
-        </w:rPr>
-        <w:t xml:space="preserve">, A. (2026). SeaAlert: Robust Severity Classification and LLM-Based Information Extraction for Noisy Maritime Distress Communications. IEEE Access, 14, 101292–101303. </w:t>
-      </w:r>
-      <w:hyperlink r:id="rId11" w:history="1">
+          <w:lang w:val="pt-BR"/>
+        </w:rPr>
+        <w:t xml:space="preserve">, A. (2026). </w:t>
+      </w:r>
+      <w:r>
+        <w:rPr>
+          <w:rFonts w:asciiTheme="majorBidi" w:hAnsiTheme="majorBidi" w:cstheme="majorBidi"/>
+        </w:rPr>
+        <w:t xml:space="preserve">SeaAlert: Robust Severity Classification and LLM-Based Information Extraction for Noisy Maritime Distress Communications. IEEE Access, 14, 101292–101303. </w:t>
+      </w:r>
+      <w:hyperlink r:id="rId33" w:history="1">
         <w:r>
           <w:rPr>
             <w:rStyle w:val="Hyperlink"/>
@@ -11449,7 +11591,7 @@
         </w:rPr>
         <w:t xml:space="preserve">, A. (2026). IRC-Bench: Recognizing Entities from Contextual Cues in First-Person Reminiscences. Machine Learning and Knowledge Extraction, 8(7), 186. </w:t>
       </w:r>
-      <w:hyperlink r:id="rId12" w:history="1">
+      <w:hyperlink r:id="rId34" w:history="1">
         <w:r>
           <w:rPr>
             <w:rStyle w:val="Hyperlink"/>
@@ -11497,7 +11639,7 @@
         </w:rPr>
         <w:t>, A., &amp; Aperstein, Y. (2026). A Benchmark for Evaluating Diagnostic Questioning Efficiency of LLMs in Patient Conversations. Scientific Reports, 16, 6121</w:t>
       </w:r>
-      <w:hyperlink r:id="rId13" w:history="1">
+      <w:hyperlink r:id="rId35" w:history="1">
         <w:r>
           <w:rPr>
             <w:rStyle w:val="Hyperlink"/>
@@ -11539,7 +11681,7 @@
         </w:rPr>
         <w:t xml:space="preserve">, A. (2025). Explainable Semantic Text Relations: A Question-Answering Framework for Comparing Document Content. Information, 16(12), 1090. </w:t>
       </w:r>
-      <w:hyperlink r:id="rId14" w:history="1">
+      <w:hyperlink r:id="rId36" w:history="1">
         <w:r>
           <w:rPr>
             <w:rStyle w:val="Hyperlink"/>
@@ -11560,55 +11702,84 @@
         <w:jc w:val="both"/>
         <w:rPr>
           <w:rFonts w:asciiTheme="majorBidi" w:hAnsiTheme="majorBidi" w:cstheme="majorBidi"/>
-        </w:rPr>
-      </w:pPr>
-      <w:r>
-        <w:rPr>
-          <w:rFonts w:asciiTheme="majorBidi" w:hAnsiTheme="majorBidi" w:cstheme="majorBidi"/>
-        </w:rPr>
-        <w:t xml:space="preserve">Apartsin, A., &amp; Aperstein, Y. (2026). Clinical Intent Extraction: A FHIR-Aligned Representation and the CIRCA Benchmark. </w:t>
-      </w:r>
-      <w:proofErr w:type="spellStart"/>
-      <w:r>
-        <w:rPr>
-          <w:rFonts w:asciiTheme="majorBidi" w:hAnsiTheme="majorBidi" w:cstheme="majorBidi"/>
-        </w:rPr>
-        <w:t>arXiv:XXXX.XXXXX</w:t>
-      </w:r>
-      <w:proofErr w:type="spellEnd"/>
-      <w:r>
-        <w:rPr>
-          <w:rFonts w:asciiTheme="majorBidi" w:hAnsiTheme="majorBidi" w:cstheme="majorBidi"/>
-        </w:rPr>
-        <w:t xml:space="preserve">, </w:t>
-      </w:r>
-      <w:hyperlink r:id="rId15" w:tgtFrame="_blank" w:history="1">
+          <w:lang w:val="en-IL"/>
+        </w:rPr>
+      </w:pPr>
+      <w:r>
+        <w:rPr>
+          <w:rFonts w:asciiTheme="majorBidi" w:hAnsiTheme="majorBidi" w:cstheme="majorBidi"/>
+          <w:u w:val="single"/>
+        </w:rPr>
+        <w:t>Apartsin</w:t>
+      </w:r>
+      <w:r>
+        <w:rPr>
+          <w:rFonts w:asciiTheme="majorBidi" w:hAnsiTheme="majorBidi" w:cstheme="majorBidi"/>
+        </w:rPr>
+        <w:t xml:space="preserve">, A., &amp; Aperstein, Y. (2026). Clinical Intent Extraction: A FHIR-Aligned Representation and the CIRCA Benchmark. </w:t>
+      </w:r>
+      <w:r>
+        <w:rPr>
+          <w:rFonts w:asciiTheme="majorBidi" w:hAnsiTheme="majorBidi" w:cstheme="majorBidi"/>
+        </w:rPr>
+        <w:t xml:space="preserve">Preprint, </w:t>
+      </w:r>
+      <w:hyperlink r:id="rId37" w:history="1">
+        <w:r>
+          <w:rPr>
+            <w:rStyle w:val="Hyperlink"/>
+            <w:rFonts w:asciiTheme="majorBidi" w:hAnsiTheme="majorBidi" w:cstheme="majorBidi"/>
+            <w:lang w:val="en-IL"/>
+          </w:rPr>
+          <w:t>https://doi.org/10.13140/RG.2.2.28773.97760</w:t>
+        </w:r>
+      </w:hyperlink>
+    </w:p>
+    <w:p>
+      <w:pPr>
+        <w:numPr>
+          <w:ilvl w:val="0"/>
+          <w:numId w:val="19"/>
+        </w:numPr>
+        <w:spacing w:after="0" w:line="360" w:lineRule="auto"/>
+        <w:jc w:val="both"/>
+        <w:rPr>
+          <w:rFonts w:asciiTheme="majorBidi" w:hAnsiTheme="majorBidi" w:cstheme="majorBidi"/>
+        </w:rPr>
+      </w:pPr>
+      <w:r>
+        <w:rPr>
+          <w:rFonts w:asciiTheme="majorBidi" w:hAnsiTheme="majorBidi" w:cstheme="majorBidi"/>
+          <w:u w:val="single"/>
+        </w:rPr>
+        <w:t>Apartsin</w:t>
+      </w:r>
+      <w:r>
+        <w:rPr>
+          <w:rFonts w:asciiTheme="majorBidi" w:hAnsiTheme="majorBidi" w:cstheme="majorBidi"/>
+        </w:rPr>
+        <w:t xml:space="preserve">, A., &amp; Aperstein, Y. (2026). Three Generations of Healthcare IT: From the Digital Record to the Computable Care Process. arXiv:2608.08806. </w:t>
+      </w:r>
+      <w:hyperlink r:id="rId38" w:history="1">
         <w:r>
           <w:rPr>
             <w:rStyle w:val="Hyperlink"/>
             <w:rFonts w:asciiTheme="majorBidi" w:hAnsiTheme="majorBidi" w:cstheme="majorBidi"/>
           </w:rPr>
-          <w:t>https://doi.org/10.48550/arXiv.XXXX.XXXXX</w:t>
+          <w:t>https://doi.org/10.48550/arXiv.2608.08806</w:t>
         </w:r>
       </w:hyperlink>
-      <w:r>
-        <w:rPr>
-          <w:rFonts w:asciiTheme="majorBidi" w:hAnsiTheme="majorBidi" w:cstheme="majorBidi"/>
-        </w:rPr>
-        <w:t xml:space="preserve">. (Preprint; not yet </w:t>
-      </w:r>
-      <w:r>
-        <w:rPr>
-          <w:rFonts w:asciiTheme="majorBidi" w:hAnsiTheme="majorBidi" w:cstheme="majorBidi"/>
-        </w:rPr>
-        <w:t>peer-reviewed</w:t>
-      </w:r>
-      <w:r>
-        <w:rPr>
-          <w:rFonts w:asciiTheme="majorBidi" w:hAnsiTheme="majorBidi" w:cstheme="majorBidi"/>
-        </w:rPr>
-        <w:t>. Harmonized intent dataset and FHIR mapper underpinning Task 1.)</w:t>
-      </w:r>
+    </w:p>
+    <w:p>
+      <w:pPr>
+        <w:pStyle w:val="ListParagraph"/>
+        <w:spacing w:line="360" w:lineRule="auto"/>
+        <w:ind w:left="360"/>
+        <w:jc w:val="both"/>
+        <w:rPr>
+          <w:rFonts w:asciiTheme="majorBidi" w:hAnsiTheme="majorBidi" w:cstheme="majorBidi"/>
+        </w:rPr>
+      </w:pPr>
     </w:p>
     <w:p>
       <w:pPr>
@@ -13540,8 +13711,8 @@
       </w:pPr>
     </w:p>
     <w:sectPr>
-      <w:footerReference w:type="default" r:id="rId16"/>
-      <w:headerReference w:type="first" r:id="rId17"/>
+      <w:footerReference w:type="default" r:id="rId39"/>
+      <w:headerReference w:type="first" r:id="rId40"/>
       <w:type w:val="nextColumn"/>
       <w:pgSz w:w="11906" w:h="16838" w:code="9"/>
       <w:pgMar w:top="1134" w:right="1134" w:bottom="1134" w:left="1134" w:header="709" w:footer="709" w:gutter="0"/>
@@ -15139,6 +15310,155 @@
     </w:lvl>
   </w:abstractNum>
   <w:abstractNum w:abstractNumId="14" w15:restartNumberingAfterBreak="0">
+    <w:nsid w:val="48DF6837"/>
+    <w:multiLevelType w:val="multilevel"/>
+    <w:tmpl w:val="B440B012"/>
+    <w:lvl w:ilvl="0">
+      <w:start w:val="1"/>
+      <w:numFmt w:val="bullet"/>
+      <w:lvlText w:val=""/>
+      <w:lvlJc w:val="left"/>
+      <w:pPr>
+        <w:tabs>
+          <w:tab w:val="num" w:pos="720"/>
+        </w:tabs>
+        <w:ind w:left="720" w:hanging="360"/>
+      </w:pPr>
+      <w:rPr>
+        <w:rFonts w:ascii="Symbol" w:hAnsi="Symbol" w:hint="default"/>
+        <w:sz w:val="20"/>
+      </w:rPr>
+    </w:lvl>
+    <w:lvl w:ilvl="1" w:tentative="1">
+      <w:start w:val="1"/>
+      <w:numFmt w:val="bullet"/>
+      <w:lvlText w:val="o"/>
+      <w:lvlJc w:val="left"/>
+      <w:pPr>
+        <w:tabs>
+          <w:tab w:val="num" w:pos="1440"/>
+        </w:tabs>
+        <w:ind w:left="1440" w:hanging="360"/>
+      </w:pPr>
+      <w:rPr>
+        <w:rFonts w:ascii="Courier New" w:hAnsi="Courier New" w:hint="default"/>
+        <w:sz w:val="20"/>
+      </w:rPr>
+    </w:lvl>
+    <w:lvl w:ilvl="2" w:tentative="1">
+      <w:start w:val="1"/>
+      <w:numFmt w:val="bullet"/>
+      <w:lvlText w:val=""/>
+      <w:lvlJc w:val="left"/>
+      <w:pPr>
+        <w:tabs>
+          <w:tab w:val="num" w:pos="2160"/>
+        </w:tabs>
+        <w:ind w:left="2160" w:hanging="360"/>
+      </w:pPr>
+      <w:rPr>
+        <w:rFonts w:ascii="Wingdings" w:hAnsi="Wingdings" w:hint="default"/>
+        <w:sz w:val="20"/>
+      </w:rPr>
+    </w:lvl>
+    <w:lvl w:ilvl="3" w:tentative="1">
+      <w:start w:val="1"/>
+      <w:numFmt w:val="bullet"/>
+      <w:lvlText w:val=""/>
+      <w:lvlJc w:val="left"/>
+      <w:pPr>
+        <w:tabs>
+          <w:tab w:val="num" w:pos="2880"/>
+        </w:tabs>
+        <w:ind w:left="2880" w:hanging="360"/>
+      </w:pPr>
+      <w:rPr>
+        <w:rFonts w:ascii="Wingdings" w:hAnsi="Wingdings" w:hint="default"/>
+        <w:sz w:val="20"/>
+      </w:rPr>
+    </w:lvl>
+    <w:lvl w:ilvl="4" w:tentative="1">
+      <w:start w:val="1"/>
+      <w:numFmt w:val="bullet"/>
+      <w:lvlText w:val=""/>
+      <w:lvlJc w:val="left"/>
+      <w:pPr>
+        <w:tabs>
+          <w:tab w:val="num" w:pos="3600"/>
+        </w:tabs>
+        <w:ind w:left="3600" w:hanging="360"/>
+      </w:pPr>
+      <w:rPr>
+        <w:rFonts w:ascii="Wingdings" w:hAnsi="Wingdings" w:hint="default"/>
+        <w:sz w:val="20"/>
+      </w:rPr>
+    </w:lvl>
+    <w:lvl w:ilvl="5" w:tentative="1">
+      <w:start w:val="1"/>
+      <w:numFmt w:val="bullet"/>
+      <w:lvlText w:val=""/>
+      <w:lvlJc w:val="left"/>
+      <w:pPr>
+        <w:tabs>
+          <w:tab w:val="num" w:pos="4320"/>
+        </w:tabs>
+        <w:ind w:left="4320" w:hanging="360"/>
+      </w:pPr>
+      <w:rPr>
+        <w:rFonts w:ascii="Wingdings" w:hAnsi="Wingdings" w:hint="default"/>
+        <w:sz w:val="20"/>
+      </w:rPr>
+    </w:lvl>
+    <w:lvl w:ilvl="6" w:tentative="1">
+      <w:start w:val="1"/>
+      <w:numFmt w:val="bullet"/>
+      <w:lvlText w:val=""/>
+      <w:lvlJc w:val="left"/>
+      <w:pPr>
+        <w:tabs>
+          <w:tab w:val="num" w:pos="5040"/>
+        </w:tabs>
+        <w:ind w:left="5040" w:hanging="360"/>
+      </w:pPr>
+      <w:rPr>
+        <w:rFonts w:ascii="Wingdings" w:hAnsi="Wingdings" w:hint="default"/>
+        <w:sz w:val="20"/>
+      </w:rPr>
+    </w:lvl>
+    <w:lvl w:ilvl="7" w:tentative="1">
+      <w:start w:val="1"/>
+      <w:numFmt w:val="bullet"/>
+      <w:lvlText w:val=""/>
+      <w:lvlJc w:val="left"/>
+      <w:pPr>
+        <w:tabs>
+          <w:tab w:val="num" w:pos="5760"/>
+        </w:tabs>
+        <w:ind w:left="5760" w:hanging="360"/>
+      </w:pPr>
+      <w:rPr>
+        <w:rFonts w:ascii="Wingdings" w:hAnsi="Wingdings" w:hint="default"/>
+        <w:sz w:val="20"/>
+      </w:rPr>
+    </w:lvl>
+    <w:lvl w:ilvl="8" w:tentative="1">
+      <w:start w:val="1"/>
+      <w:numFmt w:val="bullet"/>
+      <w:lvlText w:val=""/>
+      <w:lvlJc w:val="left"/>
+      <w:pPr>
+        <w:tabs>
+          <w:tab w:val="num" w:pos="6480"/>
+        </w:tabs>
+        <w:ind w:left="6480" w:hanging="360"/>
+      </w:pPr>
+      <w:rPr>
+        <w:rFonts w:ascii="Wingdings" w:hAnsi="Wingdings" w:hint="default"/>
+        <w:sz w:val="20"/>
+      </w:rPr>
+    </w:lvl>
+  </w:abstractNum>
+  <w:abstractNum w:abstractNumId="15" w15:restartNumberingAfterBreak="0">
     <w:nsid w:val="4A9C004E"/>
     <w:multiLevelType w:val="hybridMultilevel"/>
     <w:tmpl w:val="D5C8E4C8"/>
@@ -15250,7 +15570,7 @@
       </w:rPr>
     </w:lvl>
   </w:abstractNum>
-  <w:abstractNum w:abstractNumId="15" w15:restartNumberingAfterBreak="0">
+  <w:abstractNum w:abstractNumId="16" w15:restartNumberingAfterBreak="0">
     <w:nsid w:val="4D7677B9"/>
     <w:multiLevelType w:val="hybridMultilevel"/>
     <w:tmpl w:val="03681750"/>
@@ -15363,7 +15683,7 @@
       </w:rPr>
     </w:lvl>
   </w:abstractNum>
-  <w:abstractNum w:abstractNumId="16" w15:restartNumberingAfterBreak="0">
+  <w:abstractNum w:abstractNumId="17" w15:restartNumberingAfterBreak="0">
     <w:nsid w:val="54267B13"/>
     <w:multiLevelType w:val="hybridMultilevel"/>
     <w:tmpl w:val="2AA0C2B0"/>
@@ -15456,7 +15776,7 @@
       </w:pPr>
     </w:lvl>
   </w:abstractNum>
-  <w:abstractNum w:abstractNumId="17" w15:restartNumberingAfterBreak="0">
+  <w:abstractNum w:abstractNumId="18" w15:restartNumberingAfterBreak="0">
     <w:nsid w:val="580A4BD5"/>
     <w:multiLevelType w:val="hybridMultilevel"/>
     <w:tmpl w:val="683885BA"/>
@@ -15547,7 +15867,7 @@
       </w:pPr>
     </w:lvl>
   </w:abstractNum>
-  <w:abstractNum w:abstractNumId="18" w15:restartNumberingAfterBreak="0">
+  <w:abstractNum w:abstractNumId="19" w15:restartNumberingAfterBreak="0">
     <w:nsid w:val="5BAB070A"/>
     <w:multiLevelType w:val="hybridMultilevel"/>
     <w:tmpl w:val="0B6EDEA6"/>
@@ -15636,7 +15956,7 @@
       </w:pPr>
     </w:lvl>
   </w:abstractNum>
-  <w:abstractNum w:abstractNumId="19" w15:restartNumberingAfterBreak="0">
+  <w:abstractNum w:abstractNumId="20" w15:restartNumberingAfterBreak="0">
     <w:nsid w:val="60F302E0"/>
     <w:multiLevelType w:val="hybridMultilevel"/>
     <w:tmpl w:val="334A02CA"/>
@@ -15729,7 +16049,7 @@
       </w:pPr>
     </w:lvl>
   </w:abstractNum>
-  <w:abstractNum w:abstractNumId="20" w15:restartNumberingAfterBreak="0">
+  <w:abstractNum w:abstractNumId="21" w15:restartNumberingAfterBreak="0">
     <w:nsid w:val="63B6172C"/>
     <w:multiLevelType w:val="hybridMultilevel"/>
     <w:tmpl w:val="2EEEB928"/>
@@ -15819,7 +16139,7 @@
       </w:pPr>
     </w:lvl>
   </w:abstractNum>
-  <w:abstractNum w:abstractNumId="21" w15:restartNumberingAfterBreak="0">
+  <w:abstractNum w:abstractNumId="22" w15:restartNumberingAfterBreak="0">
     <w:nsid w:val="6D8B4629"/>
     <w:multiLevelType w:val="hybridMultilevel"/>
     <w:tmpl w:val="F3743704"/>
@@ -15932,7 +16252,7 @@
       </w:rPr>
     </w:lvl>
   </w:abstractNum>
-  <w:abstractNum w:abstractNumId="22" w15:restartNumberingAfterBreak="0">
+  <w:abstractNum w:abstractNumId="23" w15:restartNumberingAfterBreak="0">
     <w:nsid w:val="785E7B47"/>
     <w:multiLevelType w:val="hybridMultilevel"/>
     <w:tmpl w:val="B6A8BC5A"/>
@@ -16028,19 +16348,19 @@
     <w:abstractNumId w:val="1"/>
   </w:num>
   <w:num w:numId="3" w16cid:durableId="2014184928">
-    <w:abstractNumId w:val="16"/>
+    <w:abstractNumId w:val="17"/>
   </w:num>
   <w:num w:numId="4" w16cid:durableId="1193035633">
-    <w:abstractNumId w:val="18"/>
+    <w:abstractNumId w:val="19"/>
   </w:num>
   <w:num w:numId="5" w16cid:durableId="2017226350">
     <w:abstractNumId w:val="9"/>
   </w:num>
   <w:num w:numId="6" w16cid:durableId="1269696322">
-    <w:abstractNumId w:val="22"/>
+    <w:abstractNumId w:val="23"/>
   </w:num>
   <w:num w:numId="7" w16cid:durableId="1522010174">
-    <w:abstractNumId w:val="17"/>
+    <w:abstractNumId w:val="18"/>
   </w:num>
   <w:num w:numId="8" w16cid:durableId="1073166183">
     <w:abstractNumId w:val="6"/>
@@ -16049,7 +16369,7 @@
     <w:abstractNumId w:val="2"/>
   </w:num>
   <w:num w:numId="10" w16cid:durableId="899055325">
-    <w:abstractNumId w:val="14"/>
+    <w:abstractNumId w:val="15"/>
   </w:num>
   <w:num w:numId="11" w16cid:durableId="1032800638">
     <w:abstractNumId w:val="7"/>
@@ -16064,10 +16384,10 @@
     <w:abstractNumId w:val="4"/>
   </w:num>
   <w:num w:numId="15" w16cid:durableId="827327739">
-    <w:abstractNumId w:val="21"/>
+    <w:abstractNumId w:val="22"/>
   </w:num>
   <w:num w:numId="16" w16cid:durableId="191068720">
-    <w:abstractNumId w:val="15"/>
+    <w:abstractNumId w:val="16"/>
   </w:num>
   <w:num w:numId="17" w16cid:durableId="1243679074">
     <w:abstractNumId w:val="5"/>
@@ -16079,13 +16399,13 @@
     <w:abstractNumId w:val="0"/>
   </w:num>
   <w:num w:numId="20" w16cid:durableId="148062191">
-    <w:abstractNumId w:val="20"/>
+    <w:abstractNumId w:val="21"/>
   </w:num>
   <w:num w:numId="21" w16cid:durableId="115217365">
     <w:abstractNumId w:val="12"/>
   </w:num>
   <w:num w:numId="22" w16cid:durableId="694160222">
-    <w:abstractNumId w:val="17"/>
+    <w:abstractNumId w:val="18"/>
     <w:lvlOverride w:ilvl="0">
       <w:startOverride w:val="1"/>
     </w:lvlOverride>
@@ -16118,7 +16438,10 @@
     <w:abstractNumId w:val="11"/>
   </w:num>
   <w:num w:numId="24" w16cid:durableId="3558289">
-    <w:abstractNumId w:val="19"/>
+    <w:abstractNumId w:val="20"/>
+  </w:num>
+  <w:num w:numId="25" w16cid:durableId="145829247">
+    <w:abstractNumId w:val="14"/>
   </w:num>
 </w:numbering>
 </file>
@@ -18023,6 +18346,7 @@
     <w:rsid w:val="00020C77"/>
     <w:rsid w:val="00047EC1"/>
     <w:rsid w:val="00054F29"/>
+    <w:rsid w:val="000B7019"/>
     <w:rsid w:val="000D647D"/>
     <w:rsid w:val="000F49A0"/>
     <w:rsid w:val="001022C9"/>
@@ -18032,9 +18356,11 @@
     <w:rsid w:val="00194A44"/>
     <w:rsid w:val="00201E96"/>
     <w:rsid w:val="00241027"/>
+    <w:rsid w:val="002611BC"/>
     <w:rsid w:val="00296543"/>
     <w:rsid w:val="002A63DF"/>
     <w:rsid w:val="002A71D9"/>
+    <w:rsid w:val="002B54A5"/>
     <w:rsid w:val="002B6DA5"/>
     <w:rsid w:val="002E1830"/>
     <w:rsid w:val="00303D3B"/>

</xml_diff>